<commit_message>
Solución de Conflicto de Conexión con GitHub
</commit_message>
<xml_diff>
--- a/docs/DAD - Documento de Analisis y Desarrollo.docx
+++ b/docs/DAD - Documento de Analisis y Desarrollo.docx
@@ -330,10 +330,6 @@
         </w:rPr>
         <w:t>(NECESIDADES)</w:t>
       </w:r>
-    </w:p>
-    <w:p>
-      <w:bookmarkStart w:id="0" w:name="_GoBack"/>
-      <w:bookmarkEnd w:id="0"/>
     </w:p>
     <w:p/>
     <w:p/>
@@ -341,6 +337,7 @@
     <w:p/>
     <w:p/>
     <w:p/>
+    <w:p/>
     <w:p>
       <w:pPr>
         <w:pStyle w:val="Ttulo"/>
@@ -367,46 +364,20 @@
       </w:r>
     </w:p>
     <w:p>
-      <w:r>
-        <w:rPr>
-          <w:i/>
+      <w:pPr>
+        <w:ind w:left="0" w:firstLine="0"/>
+        <w:rPr>
           <w:iCs/>
           <w:color w:val="5B9BD5" w:themeColor="accent1"/>
-          <w:sz w:val="16"/>
-          <w:szCs w:val="16"/>
-        </w:rPr>
-        <w:t>Diagrama de contexto de sistema… representa todas las entidades externas que podrían interactuar c</w:t>
-      </w:r>
-      <w:r>
-        <w:rPr>
-          <w:i/>
-          <w:iCs/>
-          <w:color w:val="5B9BD5" w:themeColor="accent1"/>
-          <w:sz w:val="16"/>
-          <w:szCs w:val="16"/>
-        </w:rPr>
-        <w:t>o</w:t>
-      </w:r>
-      <w:r>
-        <w:rPr>
-          <w:i/>
-          <w:iCs/>
-          <w:color w:val="5B9BD5" w:themeColor="accent1"/>
-          <w:sz w:val="16"/>
-          <w:szCs w:val="16"/>
-        </w:rPr>
-        <w:t>n un sistema…</w:t>
-      </w:r>
-      <w:r>
-        <w:rPr>
-          <w:i/>
-          <w:iCs/>
-          <w:color w:val="5B9BD5" w:themeColor="accent1"/>
-          <w:sz w:val="16"/>
-          <w:szCs w:val="16"/>
-        </w:rPr>
-        <w:t xml:space="preserve"> lo que ingresa y sale del sistema.</w:t>
-      </w:r>
+        </w:rPr>
+      </w:pPr>
+      <w:bookmarkStart w:id="0" w:name="_GoBack"/>
+      <w:bookmarkEnd w:id="0"/>
+    </w:p>
+    <w:p>
+      <w:pPr>
+        <w:ind w:left="0" w:firstLine="0"/>
+      </w:pPr>
     </w:p>
     <w:p>
       <w:pPr>
@@ -879,6 +850,7 @@
                 <w:sz w:val="24"/>
                 <w:szCs w:val="24"/>
               </w:rPr>
+              <w:lastRenderedPageBreak/>
               <w:t>Resumen</w:t>
             </w:r>
           </w:p>
@@ -926,7 +898,6 @@
                 <w:sz w:val="24"/>
                 <w:szCs w:val="24"/>
               </w:rPr>
-              <w:lastRenderedPageBreak/>
               <w:t>Entradas</w:t>
             </w:r>
           </w:p>
@@ -1975,6 +1946,7 @@
                 <w:sz w:val="18"/>
                 <w:szCs w:val="18"/>
               </w:rPr>
+              <w:lastRenderedPageBreak/>
               <w:t>correoElectronico</w:t>
             </w:r>
             <w:proofErr w:type="spellEnd"/>
@@ -2129,7 +2101,6 @@
                 <w:sz w:val="18"/>
                 <w:szCs w:val="18"/>
               </w:rPr>
-              <w:lastRenderedPageBreak/>
               <w:t>contrasena</w:t>
             </w:r>
             <w:proofErr w:type="spellEnd"/>
@@ -2914,6 +2885,7 @@
           <w:sz w:val="24"/>
           <w:szCs w:val="24"/>
         </w:rPr>
+        <w:lastRenderedPageBreak/>
         <w:t>Dar tu opinión: Validar si la plataforma es fácil de usar y si cumple con lo que necesitas, permitiendo hacer cambios rápidos sin costo.</w:t>
       </w:r>
     </w:p>
@@ -3404,6 +3376,7 @@
                 <w:sz w:val="24"/>
                 <w:szCs w:val="24"/>
               </w:rPr>
+              <w:lastRenderedPageBreak/>
               <w:t>27</w:t>
             </w:r>
             <w:r>
@@ -9121,7 +9094,7 @@
 </file>
 
 <file path=customXml/itemProps1.xml><?xml version="1.0" encoding="utf-8"?>
-<ds:datastoreItem xmlns:ds="http://schemas.openxmlformats.org/officeDocument/2006/customXml" ds:itemID="{385FD992-3FC4-431E-B1B3-C72981A72D5C}">
+<ds:datastoreItem xmlns:ds="http://schemas.openxmlformats.org/officeDocument/2006/customXml" ds:itemID="{857BFAD0-1E33-439B-BDAC-443FB5E7502A}">
   <ds:schemaRefs>
     <ds:schemaRef ds:uri="http://schemas.openxmlformats.org/officeDocument/2006/bibliography"/>
   </ds:schemaRefs>

</xml_diff>

<commit_message>
Prueba de Agregación de Diagrama de Contexto.
</commit_message>
<xml_diff>
--- a/docs/DAD - Documento de Analisis y Desarrollo.docx
+++ b/docs/DAD - Documento de Analisis y Desarrollo.docx
@@ -5,18 +5,6 @@
     <w:p>
       <w:pPr>
         <w:spacing w:after="0" w:line="259" w:lineRule="auto"/>
-        <w:ind w:left="7" w:firstLine="0"/>
-        <w:jc w:val="center"/>
-        <w:rPr>
-          <w:rFonts w:ascii="Arial" w:eastAsia="Arial" w:hAnsi="Arial" w:cs="Arial"/>
-          <w:b/>
-          <w:sz w:val="28"/>
-        </w:rPr>
-      </w:pPr>
-    </w:p>
-    <w:p>
-      <w:pPr>
-        <w:spacing w:after="0" w:line="259" w:lineRule="auto"/>
         <w:ind w:left="0" w:firstLine="0"/>
         <w:jc w:val="center"/>
         <w:rPr>
@@ -24,6 +12,8 @@
           <w:sz w:val="18"/>
         </w:rPr>
       </w:pPr>
+      <w:bookmarkStart w:id="0" w:name="_GoBack"/>
+      <w:bookmarkEnd w:id="0"/>
       <w:r>
         <w:rPr>
           <w:rFonts w:ascii="Arial" w:eastAsia="Arial" w:hAnsi="Arial" w:cs="Arial"/>
@@ -352,7 +342,6 @@
           <w:sz w:val="24"/>
           <w:szCs w:val="24"/>
         </w:rPr>
-        <w:lastRenderedPageBreak/>
         <w:t>D</w:t>
       </w:r>
       <w:r>
@@ -371,8 +360,6 @@
           <w:color w:val="5B9BD5" w:themeColor="accent1"/>
         </w:rPr>
       </w:pPr>
-      <w:bookmarkStart w:id="0" w:name="_GoBack"/>
-      <w:bookmarkEnd w:id="0"/>
     </w:p>
     <w:p>
       <w:pPr>
@@ -850,7 +837,6 @@
                 <w:sz w:val="24"/>
                 <w:szCs w:val="24"/>
               </w:rPr>
-              <w:lastRenderedPageBreak/>
               <w:t>Resumen</w:t>
             </w:r>
           </w:p>
@@ -1015,6 +1001,7 @@
                 <w:sz w:val="24"/>
                 <w:szCs w:val="24"/>
               </w:rPr>
+              <w:lastRenderedPageBreak/>
               <w:t>Resultado</w:t>
             </w:r>
           </w:p>
@@ -1946,7 +1933,6 @@
                 <w:sz w:val="18"/>
                 <w:szCs w:val="18"/>
               </w:rPr>
-              <w:lastRenderedPageBreak/>
               <w:t>correoElectronico</w:t>
             </w:r>
             <w:proofErr w:type="spellEnd"/>
@@ -2101,6 +2087,7 @@
                 <w:sz w:val="18"/>
                 <w:szCs w:val="18"/>
               </w:rPr>
+              <w:lastRenderedPageBreak/>
               <w:t>contrasena</w:t>
             </w:r>
             <w:proofErr w:type="spellEnd"/>
@@ -2885,7 +2872,6 @@
           <w:sz w:val="24"/>
           <w:szCs w:val="24"/>
         </w:rPr>
-        <w:lastRenderedPageBreak/>
         <w:t>Dar tu opinión: Validar si la plataforma es fácil de usar y si cumple con lo que necesitas, permitiendo hacer cambios rápidos sin costo.</w:t>
       </w:r>
     </w:p>
@@ -3376,7 +3362,6 @@
                 <w:sz w:val="24"/>
                 <w:szCs w:val="24"/>
               </w:rPr>
-              <w:lastRenderedPageBreak/>
               <w:t>27</w:t>
             </w:r>
             <w:r>
@@ -9094,7 +9079,7 @@
 </file>
 
 <file path=customXml/itemProps1.xml><?xml version="1.0" encoding="utf-8"?>
-<ds:datastoreItem xmlns:ds="http://schemas.openxmlformats.org/officeDocument/2006/customXml" ds:itemID="{857BFAD0-1E33-439B-BDAC-443FB5E7502A}">
+<ds:datastoreItem xmlns:ds="http://schemas.openxmlformats.org/officeDocument/2006/customXml" ds:itemID="{11ABAFEE-F766-4F1F-9F6F-B96CE10CB9C7}">
   <ds:schemaRefs>
     <ds:schemaRef ds:uri="http://schemas.openxmlformats.org/officeDocument/2006/bibliography"/>
   </ds:schemaRefs>

</xml_diff>

<commit_message>
Agregacion del Diagrama de Contexto del Sistema - Nivel 0
</commit_message>
<xml_diff>
--- a/docs/DAD - Documento de Analisis y Desarrollo.docx
+++ b/docs/DAD - Documento de Analisis y Desarrollo.docx
@@ -12,8 +12,6 @@
           <w:sz w:val="18"/>
         </w:rPr>
       </w:pPr>
-      <w:bookmarkStart w:id="0" w:name="_GoBack"/>
-      <w:bookmarkEnd w:id="0"/>
       <w:r>
         <w:rPr>
           <w:rFonts w:ascii="Arial" w:eastAsia="Arial" w:hAnsi="Arial" w:cs="Arial"/>
@@ -193,24 +191,8 @@
         </w:rPr>
         <w:t xml:space="preserve">Asimismo, el negocio necesita llevar un registro organizado de sus </w:t>
       </w:r>
-      <w:r>
-        <w:rPr>
-          <w:rFonts w:ascii="Source Sans Pro" w:eastAsia="Times New Roman" w:hAnsi="Source Sans Pro" w:cs="Times New Roman"/>
-          <w:b/>
-          <w:bCs/>
-          <w:color w:val="auto"/>
-          <w:lang w:val="es-MX" w:eastAsia="es-MX"/>
-        </w:rPr>
-        <w:t>clientes</w:t>
-      </w:r>
-      <w:r>
-        <w:rPr>
-          <w:rFonts w:ascii="Source Sans Pro" w:eastAsia="Times New Roman" w:hAnsi="Source Sans Pro" w:cs="Times New Roman"/>
-          <w:color w:val="auto"/>
-          <w:lang w:val="es-MX" w:eastAsia="es-MX"/>
-        </w:rPr>
-        <w:t xml:space="preserve"> frecuentes y de los </w:t>
-      </w:r>
+      <w:bookmarkStart w:id="0" w:name="_GoBack"/>
+      <w:bookmarkEnd w:id="0"/>
       <w:r>
         <w:rPr>
           <w:rFonts w:ascii="Source Sans Pro" w:eastAsia="Times New Roman" w:hAnsi="Source Sans Pro" w:cs="Times New Roman"/>
@@ -9079,7 +9061,7 @@
 </file>
 
 <file path=customXml/itemProps1.xml><?xml version="1.0" encoding="utf-8"?>
-<ds:datastoreItem xmlns:ds="http://schemas.openxmlformats.org/officeDocument/2006/customXml" ds:itemID="{11ABAFEE-F766-4F1F-9F6F-B96CE10CB9C7}">
+<ds:datastoreItem xmlns:ds="http://schemas.openxmlformats.org/officeDocument/2006/customXml" ds:itemID="{34EA3736-D74C-42F1-B559-C516C443129A}">
   <ds:schemaRefs>
     <ds:schemaRef ds:uri="http://schemas.openxmlformats.org/officeDocument/2006/bibliography"/>
   </ds:schemaRefs>

</xml_diff>

<commit_message>
Agregación del Diagrama de Contexto - Nivel 0 al DAD
</commit_message>
<xml_diff>
--- a/docs/DAD - Documento de Analisis y Desarrollo.docx
+++ b/docs/DAD - Documento de Analisis y Desarrollo.docx
@@ -191,8 +191,6 @@
         </w:rPr>
         <w:t xml:space="preserve">Asimismo, el negocio necesita llevar un registro organizado de sus </w:t>
       </w:r>
-      <w:bookmarkStart w:id="0" w:name="_GoBack"/>
-      <w:bookmarkEnd w:id="0"/>
       <w:r>
         <w:rPr>
           <w:rFonts w:ascii="Source Sans Pro" w:eastAsia="Times New Roman" w:hAnsi="Source Sans Pro" w:cs="Times New Roman"/>
@@ -310,6 +308,7 @@
     <w:p/>
     <w:p/>
     <w:p/>
+    <w:p/>
     <w:p>
       <w:pPr>
         <w:pStyle w:val="Ttulo"/>
@@ -324,6 +323,7 @@
           <w:sz w:val="24"/>
           <w:szCs w:val="24"/>
         </w:rPr>
+        <w:lastRenderedPageBreak/>
         <w:t>D</w:t>
       </w:r>
       <w:r>
@@ -342,6 +342,54 @@
           <w:color w:val="5B9BD5" w:themeColor="accent1"/>
         </w:rPr>
       </w:pPr>
+      <w:r>
+        <w:rPr>
+          <w:iCs/>
+          <w:noProof/>
+          <w:color w:val="5B9BD5" w:themeColor="accent1"/>
+        </w:rPr>
+        <w:drawing>
+          <wp:inline distT="0" distB="0" distL="0" distR="0" wp14:anchorId="648208A5" wp14:editId="7178D916">
+            <wp:extent cx="5609590" cy="5617845"/>
+            <wp:effectExtent l="0" t="0" r="0" b="1905"/>
+            <wp:docPr id="1" name="Imagen 1"/>
+            <wp:cNvGraphicFramePr>
+              <a:graphicFrameLocks xmlns:a="http://schemas.openxmlformats.org/drawingml/2006/main" noChangeAspect="1"/>
+            </wp:cNvGraphicFramePr>
+            <a:graphic xmlns:a="http://schemas.openxmlformats.org/drawingml/2006/main">
+              <a:graphicData uri="http://schemas.openxmlformats.org/drawingml/2006/picture">
+                <pic:pic xmlns:pic="http://schemas.openxmlformats.org/drawingml/2006/picture">
+                  <pic:nvPicPr>
+                    <pic:cNvPr id="1" name="Sistema Inventario - Nivel 0.png"/>
+                    <pic:cNvPicPr/>
+                  </pic:nvPicPr>
+                  <pic:blipFill>
+                    <a:blip r:embed="rId8">
+                      <a:extLst>
+                        <a:ext uri="{28A0092B-C50C-407E-A947-70E740481C1C}">
+                          <a14:useLocalDpi xmlns:a14="http://schemas.microsoft.com/office/drawing/2010/main" val="0"/>
+                        </a:ext>
+                      </a:extLst>
+                    </a:blip>
+                    <a:stretch>
+                      <a:fillRect/>
+                    </a:stretch>
+                  </pic:blipFill>
+                  <pic:spPr>
+                    <a:xfrm>
+                      <a:off x="0" y="0"/>
+                      <a:ext cx="5609590" cy="5617845"/>
+                    </a:xfrm>
+                    <a:prstGeom prst="rect">
+                      <a:avLst/>
+                    </a:prstGeom>
+                  </pic:spPr>
+                </pic:pic>
+              </a:graphicData>
+            </a:graphic>
+          </wp:inline>
+        </w:drawing>
+      </w:r>
     </w:p>
     <w:p>
       <w:pPr>
@@ -350,6 +398,28 @@
     </w:p>
     <w:p>
       <w:pPr>
+        <w:ind w:left="0" w:firstLine="0"/>
+      </w:pPr>
+    </w:p>
+    <w:p>
+      <w:pPr>
+        <w:ind w:left="0" w:firstLine="0"/>
+      </w:pPr>
+    </w:p>
+    <w:p>
+      <w:pPr>
+        <w:ind w:left="0" w:firstLine="0"/>
+      </w:pPr>
+    </w:p>
+    <w:p>
+      <w:pPr>
+        <w:ind w:left="0" w:firstLine="0"/>
+      </w:pPr>
+      <w:bookmarkStart w:id="0" w:name="_GoBack"/>
+      <w:bookmarkEnd w:id="0"/>
+    </w:p>
+    <w:p>
+      <w:pPr>
         <w:pStyle w:val="Ttulo"/>
         <w:spacing w:line="276" w:lineRule="auto"/>
         <w:rPr>
@@ -362,6 +432,7 @@
           <w:sz w:val="24"/>
           <w:szCs w:val="24"/>
         </w:rPr>
+        <w:lastRenderedPageBreak/>
         <w:t>Diagrama de caso de uso</w:t>
       </w:r>
     </w:p>
@@ -667,7 +738,7 @@
                     </pic:cNvPicPr>
                   </pic:nvPicPr>
                   <pic:blipFill>
-                    <a:blip r:embed="rId8">
+                    <a:blip r:embed="rId9">
                       <a:extLst>
                         <a:ext uri="{28A0092B-C50C-407E-A947-70E740481C1C}">
                           <a14:useLocalDpi xmlns:a14="http://schemas.microsoft.com/office/drawing/2010/main" val="0"/>
@@ -983,7 +1054,6 @@
                 <w:sz w:val="24"/>
                 <w:szCs w:val="24"/>
               </w:rPr>
-              <w:lastRenderedPageBreak/>
               <w:t>Resultado</w:t>
             </w:r>
           </w:p>
@@ -1070,6 +1140,7 @@
                 <w:sz w:val="24"/>
                 <w:szCs w:val="24"/>
               </w:rPr>
+              <w:lastRenderedPageBreak/>
               <w:t>Validaciones Mínimas de aceptación</w:t>
             </w:r>
           </w:p>
@@ -2069,7 +2140,6 @@
                 <w:sz w:val="18"/>
                 <w:szCs w:val="18"/>
               </w:rPr>
-              <w:lastRenderedPageBreak/>
               <w:t>contrasena</w:t>
             </w:r>
             <w:proofErr w:type="spellEnd"/>
@@ -2242,6 +2312,7 @@
                 <w:sz w:val="18"/>
                 <w:szCs w:val="18"/>
               </w:rPr>
+              <w:lastRenderedPageBreak/>
               <w:t>fechaRegistro</w:t>
             </w:r>
             <w:proofErr w:type="spellEnd"/>
@@ -2893,6 +2964,7 @@
           <w:sz w:val="24"/>
           <w:szCs w:val="24"/>
         </w:rPr>
+        <w:lastRenderedPageBreak/>
         <w:t>Diagrama de clases del GUI.</w:t>
       </w:r>
     </w:p>
@@ -3491,12 +3563,12 @@
       </w:pPr>
     </w:p>
     <w:sectPr>
-      <w:headerReference w:type="even" r:id="rId9"/>
-      <w:headerReference w:type="default" r:id="rId10"/>
-      <w:footerReference w:type="even" r:id="rId11"/>
-      <w:footerReference w:type="default" r:id="rId12"/>
-      <w:headerReference w:type="first" r:id="rId13"/>
-      <w:footerReference w:type="first" r:id="rId14"/>
+      <w:headerReference w:type="even" r:id="rId10"/>
+      <w:headerReference w:type="default" r:id="rId11"/>
+      <w:footerReference w:type="even" r:id="rId12"/>
+      <w:footerReference w:type="default" r:id="rId13"/>
+      <w:headerReference w:type="first" r:id="rId14"/>
+      <w:footerReference w:type="first" r:id="rId15"/>
       <w:pgSz w:w="12240" w:h="15840"/>
       <w:pgMar w:top="1697" w:right="1704" w:bottom="1839" w:left="1702" w:header="42" w:footer="0" w:gutter="0"/>
       <w:cols w:space="720"/>
@@ -9061,7 +9133,7 @@
 </file>
 
 <file path=customXml/itemProps1.xml><?xml version="1.0" encoding="utf-8"?>
-<ds:datastoreItem xmlns:ds="http://schemas.openxmlformats.org/officeDocument/2006/customXml" ds:itemID="{34EA3736-D74C-42F1-B559-C516C443129A}">
+<ds:datastoreItem xmlns:ds="http://schemas.openxmlformats.org/officeDocument/2006/customXml" ds:itemID="{E738A09C-D904-4117-B113-C5205339FC26}">
   <ds:schemaRefs>
     <ds:schemaRef ds:uri="http://schemas.openxmlformats.org/officeDocument/2006/bibliography"/>
   </ds:schemaRefs>

</xml_diff>